<commit_message>
fix: align customer use case artifacts
</commit_message>
<xml_diff>
--- a/docs/use-cases/customer-use-case-specifications.docx
+++ b/docs/use-cases/customer-use-case-specifications.docx
@@ -44,8 +44,8 @@
         <w:tblLook w:firstColumn="1" w:firstRow="1" w:lastColumn="0" w:lastRow="0" w:noHBand="0" w:noVBand="1" w:val="04A0"/>
       </w:tblPr>
       <w:tblGrid>
-        <w:gridCol w:w="4986"/>
-        <w:gridCol w:w="4986"/>
+        <w:gridCol w:w="4819"/>
+        <w:gridCol w:w="4819"/>
       </w:tblGrid>
       <w:tr>
         <w:trPr>
@@ -53,7 +53,7 @@
         </w:trPr>
         <w:tc>
           <w:tcPr>
-            <w:tcW w:type="dxa" w:w="4986"/>
+            <w:tcW w:type="dxa" w:w="4819"/>
             <w:vAlign w:val="center"/>
             <w:tcBorders>
               <w:top w:val="single" w:sz="6" w:space="0" w:color="D9D9D9"/>
@@ -89,7 +89,7 @@
         </w:tc>
         <w:tc>
           <w:tcPr>
-            <w:tcW w:type="dxa" w:w="4986"/>
+            <w:tcW w:type="dxa" w:w="4819"/>
             <w:vAlign w:val="center"/>
             <w:tcBorders>
               <w:top w:val="single" w:sz="6" w:space="0" w:color="D9D9D9"/>
@@ -127,7 +127,7 @@
       <w:tr>
         <w:tc>
           <w:tcPr>
-            <w:tcW w:type="dxa" w:w="4986"/>
+            <w:tcW w:type="dxa" w:w="4819"/>
             <w:vAlign w:val="center"/>
             <w:tcBorders>
               <w:top w:val="single" w:sz="6" w:space="0" w:color="D9D9D9"/>
@@ -163,7 +163,7 @@
         </w:tc>
         <w:tc>
           <w:tcPr>
-            <w:tcW w:type="dxa" w:w="4986"/>
+            <w:tcW w:type="dxa" w:w="4819"/>
             <w:vAlign w:val="center"/>
             <w:tcBorders>
               <w:top w:val="single" w:sz="6" w:space="0" w:color="D9D9D9"/>
@@ -200,7 +200,7 @@
       <w:tr>
         <w:tc>
           <w:tcPr>
-            <w:tcW w:type="dxa" w:w="4986"/>
+            <w:tcW w:type="dxa" w:w="4819"/>
             <w:vAlign w:val="center"/>
             <w:tcBorders>
               <w:top w:val="single" w:sz="6" w:space="0" w:color="D9D9D9"/>
@@ -236,7 +236,7 @@
         </w:tc>
         <w:tc>
           <w:tcPr>
-            <w:tcW w:type="dxa" w:w="4986"/>
+            <w:tcW w:type="dxa" w:w="4819"/>
             <w:vAlign w:val="center"/>
             <w:tcBorders>
               <w:top w:val="single" w:sz="6" w:space="0" w:color="D9D9D9"/>
@@ -273,7 +273,7 @@
       <w:tr>
         <w:tc>
           <w:tcPr>
-            <w:tcW w:type="dxa" w:w="4986"/>
+            <w:tcW w:type="dxa" w:w="4819"/>
             <w:vAlign w:val="center"/>
             <w:tcBorders>
               <w:top w:val="single" w:sz="6" w:space="0" w:color="D9D9D9"/>
@@ -309,7 +309,7 @@
         </w:tc>
         <w:tc>
           <w:tcPr>
-            <w:tcW w:type="dxa" w:w="4986"/>
+            <w:tcW w:type="dxa" w:w="4819"/>
             <w:vAlign w:val="center"/>
             <w:tcBorders>
               <w:top w:val="single" w:sz="6" w:space="0" w:color="D9D9D9"/>
@@ -346,7 +346,7 @@
       <w:tr>
         <w:tc>
           <w:tcPr>
-            <w:tcW w:type="dxa" w:w="4986"/>
+            <w:tcW w:type="dxa" w:w="4819"/>
             <w:vAlign w:val="center"/>
             <w:tcBorders>
               <w:top w:val="single" w:sz="6" w:space="0" w:color="D9D9D9"/>
@@ -382,7 +382,7 @@
         </w:tc>
         <w:tc>
           <w:tcPr>
-            <w:tcW w:type="dxa" w:w="4986"/>
+            <w:tcW w:type="dxa" w:w="4819"/>
             <w:vAlign w:val="center"/>
             <w:tcBorders>
               <w:top w:val="single" w:sz="6" w:space="0" w:color="D9D9D9"/>
@@ -419,7 +419,7 @@
       <w:tr>
         <w:tc>
           <w:tcPr>
-            <w:tcW w:type="dxa" w:w="4986"/>
+            <w:tcW w:type="dxa" w:w="4819"/>
             <w:vAlign w:val="center"/>
             <w:tcBorders>
               <w:top w:val="single" w:sz="6" w:space="0" w:color="D9D9D9"/>
@@ -455,7 +455,7 @@
         </w:tc>
         <w:tc>
           <w:tcPr>
-            <w:tcW w:type="dxa" w:w="4986"/>
+            <w:tcW w:type="dxa" w:w="4819"/>
             <w:vAlign w:val="center"/>
             <w:tcBorders>
               <w:top w:val="single" w:sz="6" w:space="0" w:color="D9D9D9"/>
@@ -568,11 +568,11 @@
         <w:tblLook w:firstColumn="1" w:firstRow="1" w:lastColumn="0" w:lastRow="0" w:noHBand="0" w:noVBand="1" w:val="04A0"/>
       </w:tblPr>
       <w:tblGrid>
-        <w:gridCol w:w="1994"/>
-        <w:gridCol w:w="1994"/>
-        <w:gridCol w:w="1994"/>
-        <w:gridCol w:w="1994"/>
-        <w:gridCol w:w="1994"/>
+        <w:gridCol w:w="1928"/>
+        <w:gridCol w:w="1928"/>
+        <w:gridCol w:w="1928"/>
+        <w:gridCol w:w="1928"/>
+        <w:gridCol w:w="1928"/>
       </w:tblGrid>
       <w:tr>
         <w:trPr>
@@ -580,7 +580,7 @@
         </w:trPr>
         <w:tc>
           <w:tcPr>
-            <w:tcW w:type="dxa" w:w="1994"/>
+            <w:tcW w:type="dxa" w:w="1928"/>
             <w:vAlign w:val="center"/>
             <w:tcBorders>
               <w:top w:val="single" w:sz="6" w:space="0" w:color="D9D9D9"/>
@@ -616,7 +616,7 @@
         </w:tc>
         <w:tc>
           <w:tcPr>
-            <w:tcW w:type="dxa" w:w="1994"/>
+            <w:tcW w:type="dxa" w:w="1928"/>
             <w:vAlign w:val="center"/>
             <w:tcBorders>
               <w:top w:val="single" w:sz="6" w:space="0" w:color="D9D9D9"/>
@@ -652,7 +652,7 @@
         </w:tc>
         <w:tc>
           <w:tcPr>
-            <w:tcW w:type="dxa" w:w="1994"/>
+            <w:tcW w:type="dxa" w:w="1928"/>
             <w:vAlign w:val="center"/>
             <w:tcBorders>
               <w:top w:val="single" w:sz="6" w:space="0" w:color="D9D9D9"/>
@@ -688,7 +688,7 @@
         </w:tc>
         <w:tc>
           <w:tcPr>
-            <w:tcW w:type="dxa" w:w="1994"/>
+            <w:tcW w:type="dxa" w:w="1928"/>
             <w:vAlign w:val="center"/>
             <w:tcBorders>
               <w:top w:val="single" w:sz="6" w:space="0" w:color="D9D9D9"/>
@@ -724,7 +724,7 @@
         </w:tc>
         <w:tc>
           <w:tcPr>
-            <w:tcW w:type="dxa" w:w="1994"/>
+            <w:tcW w:type="dxa" w:w="1928"/>
             <w:vAlign w:val="center"/>
             <w:tcBorders>
               <w:top w:val="single" w:sz="6" w:space="0" w:color="D9D9D9"/>
@@ -762,7 +762,7 @@
       <w:tr>
         <w:tc>
           <w:tcPr>
-            <w:tcW w:type="dxa" w:w="1994"/>
+            <w:tcW w:type="dxa" w:w="1928"/>
             <w:vAlign w:val="center"/>
             <w:tcBorders>
               <w:top w:val="single" w:sz="6" w:space="0" w:color="D9D9D9"/>
@@ -797,7 +797,7 @@
         </w:tc>
         <w:tc>
           <w:tcPr>
-            <w:tcW w:type="dxa" w:w="1994"/>
+            <w:tcW w:type="dxa" w:w="1928"/>
             <w:vAlign w:val="center"/>
             <w:tcBorders>
               <w:top w:val="single" w:sz="6" w:space="0" w:color="D9D9D9"/>
@@ -832,7 +832,7 @@
         </w:tc>
         <w:tc>
           <w:tcPr>
-            <w:tcW w:type="dxa" w:w="1994"/>
+            <w:tcW w:type="dxa" w:w="1928"/>
             <w:vAlign w:val="center"/>
             <w:tcBorders>
               <w:top w:val="single" w:sz="6" w:space="0" w:color="D9D9D9"/>
@@ -867,7 +867,7 @@
         </w:tc>
         <w:tc>
           <w:tcPr>
-            <w:tcW w:type="dxa" w:w="1994"/>
+            <w:tcW w:type="dxa" w:w="1928"/>
             <w:vAlign w:val="center"/>
             <w:tcBorders>
               <w:top w:val="single" w:sz="6" w:space="0" w:color="D9D9D9"/>
@@ -902,7 +902,7 @@
         </w:tc>
         <w:tc>
           <w:tcPr>
-            <w:tcW w:type="dxa" w:w="1994"/>
+            <w:tcW w:type="dxa" w:w="1928"/>
             <w:vAlign w:val="center"/>
             <w:tcBorders>
               <w:top w:val="single" w:sz="6" w:space="0" w:color="D9D9D9"/>
@@ -939,7 +939,7 @@
       <w:tr>
         <w:tc>
           <w:tcPr>
-            <w:tcW w:type="dxa" w:w="1994"/>
+            <w:tcW w:type="dxa" w:w="1928"/>
             <w:vAlign w:val="center"/>
             <w:tcBorders>
               <w:top w:val="single" w:sz="6" w:space="0" w:color="D9D9D9"/>
@@ -974,7 +974,7 @@
         </w:tc>
         <w:tc>
           <w:tcPr>
-            <w:tcW w:type="dxa" w:w="1994"/>
+            <w:tcW w:type="dxa" w:w="1928"/>
             <w:vAlign w:val="center"/>
             <w:tcBorders>
               <w:top w:val="single" w:sz="6" w:space="0" w:color="D9D9D9"/>
@@ -1009,7 +1009,7 @@
         </w:tc>
         <w:tc>
           <w:tcPr>
-            <w:tcW w:type="dxa" w:w="1994"/>
+            <w:tcW w:type="dxa" w:w="1928"/>
             <w:vAlign w:val="center"/>
             <w:tcBorders>
               <w:top w:val="single" w:sz="6" w:space="0" w:color="D9D9D9"/>
@@ -1044,7 +1044,7 @@
         </w:tc>
         <w:tc>
           <w:tcPr>
-            <w:tcW w:type="dxa" w:w="1994"/>
+            <w:tcW w:type="dxa" w:w="1928"/>
             <w:vAlign w:val="center"/>
             <w:tcBorders>
               <w:top w:val="single" w:sz="6" w:space="0" w:color="D9D9D9"/>
@@ -1079,7 +1079,7 @@
         </w:tc>
         <w:tc>
           <w:tcPr>
-            <w:tcW w:type="dxa" w:w="1994"/>
+            <w:tcW w:type="dxa" w:w="1928"/>
             <w:vAlign w:val="center"/>
             <w:tcBorders>
               <w:top w:val="single" w:sz="6" w:space="0" w:color="D9D9D9"/>
@@ -1116,7 +1116,7 @@
       <w:tr>
         <w:tc>
           <w:tcPr>
-            <w:tcW w:type="dxa" w:w="1994"/>
+            <w:tcW w:type="dxa" w:w="1928"/>
             <w:vAlign w:val="center"/>
             <w:tcBorders>
               <w:top w:val="single" w:sz="6" w:space="0" w:color="D9D9D9"/>
@@ -1151,7 +1151,7 @@
         </w:tc>
         <w:tc>
           <w:tcPr>
-            <w:tcW w:type="dxa" w:w="1994"/>
+            <w:tcW w:type="dxa" w:w="1928"/>
             <w:vAlign w:val="center"/>
             <w:tcBorders>
               <w:top w:val="single" w:sz="6" w:space="0" w:color="D9D9D9"/>
@@ -1186,7 +1186,7 @@
         </w:tc>
         <w:tc>
           <w:tcPr>
-            <w:tcW w:type="dxa" w:w="1994"/>
+            <w:tcW w:type="dxa" w:w="1928"/>
             <w:vAlign w:val="center"/>
             <w:tcBorders>
               <w:top w:val="single" w:sz="6" w:space="0" w:color="D9D9D9"/>
@@ -1221,7 +1221,7 @@
         </w:tc>
         <w:tc>
           <w:tcPr>
-            <w:tcW w:type="dxa" w:w="1994"/>
+            <w:tcW w:type="dxa" w:w="1928"/>
             <w:vAlign w:val="center"/>
             <w:tcBorders>
               <w:top w:val="single" w:sz="6" w:space="0" w:color="D9D9D9"/>
@@ -1256,7 +1256,7 @@
         </w:tc>
         <w:tc>
           <w:tcPr>
-            <w:tcW w:type="dxa" w:w="1994"/>
+            <w:tcW w:type="dxa" w:w="1928"/>
             <w:vAlign w:val="center"/>
             <w:tcBorders>
               <w:top w:val="single" w:sz="6" w:space="0" w:color="D9D9D9"/>
@@ -1293,7 +1293,7 @@
       <w:tr>
         <w:tc>
           <w:tcPr>
-            <w:tcW w:type="dxa" w:w="1994"/>
+            <w:tcW w:type="dxa" w:w="1928"/>
             <w:vAlign w:val="center"/>
             <w:tcBorders>
               <w:top w:val="single" w:sz="6" w:space="0" w:color="D9D9D9"/>
@@ -1328,7 +1328,7 @@
         </w:tc>
         <w:tc>
           <w:tcPr>
-            <w:tcW w:type="dxa" w:w="1994"/>
+            <w:tcW w:type="dxa" w:w="1928"/>
             <w:vAlign w:val="center"/>
             <w:tcBorders>
               <w:top w:val="single" w:sz="6" w:space="0" w:color="D9D9D9"/>
@@ -1363,7 +1363,7 @@
         </w:tc>
         <w:tc>
           <w:tcPr>
-            <w:tcW w:type="dxa" w:w="1994"/>
+            <w:tcW w:type="dxa" w:w="1928"/>
             <w:vAlign w:val="center"/>
             <w:tcBorders>
               <w:top w:val="single" w:sz="6" w:space="0" w:color="D9D9D9"/>
@@ -1398,7 +1398,7 @@
         </w:tc>
         <w:tc>
           <w:tcPr>
-            <w:tcW w:type="dxa" w:w="1994"/>
+            <w:tcW w:type="dxa" w:w="1928"/>
             <w:vAlign w:val="center"/>
             <w:tcBorders>
               <w:top w:val="single" w:sz="6" w:space="0" w:color="D9D9D9"/>
@@ -1433,7 +1433,7 @@
         </w:tc>
         <w:tc>
           <w:tcPr>
-            <w:tcW w:type="dxa" w:w="1994"/>
+            <w:tcW w:type="dxa" w:w="1928"/>
             <w:vAlign w:val="center"/>
             <w:tcBorders>
               <w:top w:val="single" w:sz="6" w:space="0" w:color="D9D9D9"/>
@@ -1470,7 +1470,7 @@
       <w:tr>
         <w:tc>
           <w:tcPr>
-            <w:tcW w:type="dxa" w:w="1994"/>
+            <w:tcW w:type="dxa" w:w="1928"/>
             <w:vAlign w:val="center"/>
             <w:tcBorders>
               <w:top w:val="single" w:sz="6" w:space="0" w:color="D9D9D9"/>
@@ -1505,7 +1505,7 @@
         </w:tc>
         <w:tc>
           <w:tcPr>
-            <w:tcW w:type="dxa" w:w="1994"/>
+            <w:tcW w:type="dxa" w:w="1928"/>
             <w:vAlign w:val="center"/>
             <w:tcBorders>
               <w:top w:val="single" w:sz="6" w:space="0" w:color="D9D9D9"/>
@@ -1540,7 +1540,7 @@
         </w:tc>
         <w:tc>
           <w:tcPr>
-            <w:tcW w:type="dxa" w:w="1994"/>
+            <w:tcW w:type="dxa" w:w="1928"/>
             <w:vAlign w:val="center"/>
             <w:tcBorders>
               <w:top w:val="single" w:sz="6" w:space="0" w:color="D9D9D9"/>
@@ -1575,7 +1575,7 @@
         </w:tc>
         <w:tc>
           <w:tcPr>
-            <w:tcW w:type="dxa" w:w="1994"/>
+            <w:tcW w:type="dxa" w:w="1928"/>
             <w:vAlign w:val="center"/>
             <w:tcBorders>
               <w:top w:val="single" w:sz="6" w:space="0" w:color="D9D9D9"/>
@@ -1610,7 +1610,7 @@
         </w:tc>
         <w:tc>
           <w:tcPr>
-            <w:tcW w:type="dxa" w:w="1994"/>
+            <w:tcW w:type="dxa" w:w="1928"/>
             <w:vAlign w:val="center"/>
             <w:tcBorders>
               <w:top w:val="single" w:sz="6" w:space="0" w:color="D9D9D9"/>
@@ -1647,7 +1647,7 @@
       <w:tr>
         <w:tc>
           <w:tcPr>
-            <w:tcW w:type="dxa" w:w="1994"/>
+            <w:tcW w:type="dxa" w:w="1928"/>
             <w:vAlign w:val="center"/>
             <w:tcBorders>
               <w:top w:val="single" w:sz="6" w:space="0" w:color="D9D9D9"/>
@@ -1682,7 +1682,7 @@
         </w:tc>
         <w:tc>
           <w:tcPr>
-            <w:tcW w:type="dxa" w:w="1994"/>
+            <w:tcW w:type="dxa" w:w="1928"/>
             <w:vAlign w:val="center"/>
             <w:tcBorders>
               <w:top w:val="single" w:sz="6" w:space="0" w:color="D9D9D9"/>
@@ -1717,7 +1717,7 @@
         </w:tc>
         <w:tc>
           <w:tcPr>
-            <w:tcW w:type="dxa" w:w="1994"/>
+            <w:tcW w:type="dxa" w:w="1928"/>
             <w:vAlign w:val="center"/>
             <w:tcBorders>
               <w:top w:val="single" w:sz="6" w:space="0" w:color="D9D9D9"/>
@@ -1752,7 +1752,7 @@
         </w:tc>
         <w:tc>
           <w:tcPr>
-            <w:tcW w:type="dxa" w:w="1994"/>
+            <w:tcW w:type="dxa" w:w="1928"/>
             <w:vAlign w:val="center"/>
             <w:tcBorders>
               <w:top w:val="single" w:sz="6" w:space="0" w:color="D9D9D9"/>
@@ -1787,7 +1787,7 @@
         </w:tc>
         <w:tc>
           <w:tcPr>
-            <w:tcW w:type="dxa" w:w="1994"/>
+            <w:tcW w:type="dxa" w:w="1928"/>
             <w:vAlign w:val="center"/>
             <w:tcBorders>
               <w:top w:val="single" w:sz="6" w:space="0" w:color="D9D9D9"/>
@@ -1824,7 +1824,7 @@
       <w:tr>
         <w:tc>
           <w:tcPr>
-            <w:tcW w:type="dxa" w:w="1994"/>
+            <w:tcW w:type="dxa" w:w="1928"/>
             <w:vAlign w:val="center"/>
             <w:tcBorders>
               <w:top w:val="single" w:sz="6" w:space="0" w:color="D9D9D9"/>
@@ -1859,7 +1859,7 @@
         </w:tc>
         <w:tc>
           <w:tcPr>
-            <w:tcW w:type="dxa" w:w="1994"/>
+            <w:tcW w:type="dxa" w:w="1928"/>
             <w:vAlign w:val="center"/>
             <w:tcBorders>
               <w:top w:val="single" w:sz="6" w:space="0" w:color="D9D9D9"/>
@@ -1894,7 +1894,7 @@
         </w:tc>
         <w:tc>
           <w:tcPr>
-            <w:tcW w:type="dxa" w:w="1994"/>
+            <w:tcW w:type="dxa" w:w="1928"/>
             <w:vAlign w:val="center"/>
             <w:tcBorders>
               <w:top w:val="single" w:sz="6" w:space="0" w:color="D9D9D9"/>
@@ -1929,7 +1929,7 @@
         </w:tc>
         <w:tc>
           <w:tcPr>
-            <w:tcW w:type="dxa" w:w="1994"/>
+            <w:tcW w:type="dxa" w:w="1928"/>
             <w:vAlign w:val="center"/>
             <w:tcBorders>
               <w:top w:val="single" w:sz="6" w:space="0" w:color="D9D9D9"/>
@@ -1964,7 +1964,7 @@
         </w:tc>
         <w:tc>
           <w:tcPr>
-            <w:tcW w:type="dxa" w:w="1994"/>
+            <w:tcW w:type="dxa" w:w="1928"/>
             <w:vAlign w:val="center"/>
             <w:tcBorders>
               <w:top w:val="single" w:sz="6" w:space="0" w:color="D9D9D9"/>
@@ -2001,7 +2001,7 @@
       <w:tr>
         <w:tc>
           <w:tcPr>
-            <w:tcW w:type="dxa" w:w="1994"/>
+            <w:tcW w:type="dxa" w:w="1928"/>
             <w:vAlign w:val="center"/>
             <w:tcBorders>
               <w:top w:val="single" w:sz="6" w:space="0" w:color="D9D9D9"/>
@@ -2036,7 +2036,7 @@
         </w:tc>
         <w:tc>
           <w:tcPr>
-            <w:tcW w:type="dxa" w:w="1994"/>
+            <w:tcW w:type="dxa" w:w="1928"/>
             <w:vAlign w:val="center"/>
             <w:tcBorders>
               <w:top w:val="single" w:sz="6" w:space="0" w:color="D9D9D9"/>
@@ -2071,7 +2071,7 @@
         </w:tc>
         <w:tc>
           <w:tcPr>
-            <w:tcW w:type="dxa" w:w="1994"/>
+            <w:tcW w:type="dxa" w:w="1928"/>
             <w:vAlign w:val="center"/>
             <w:tcBorders>
               <w:top w:val="single" w:sz="6" w:space="0" w:color="D9D9D9"/>
@@ -2106,7 +2106,7 @@
         </w:tc>
         <w:tc>
           <w:tcPr>
-            <w:tcW w:type="dxa" w:w="1994"/>
+            <w:tcW w:type="dxa" w:w="1928"/>
             <w:vAlign w:val="center"/>
             <w:tcBorders>
               <w:top w:val="single" w:sz="6" w:space="0" w:color="D9D9D9"/>
@@ -2141,7 +2141,7 @@
         </w:tc>
         <w:tc>
           <w:tcPr>
-            <w:tcW w:type="dxa" w:w="1994"/>
+            <w:tcW w:type="dxa" w:w="1928"/>
             <w:vAlign w:val="center"/>
             <w:tcBorders>
               <w:top w:val="single" w:sz="6" w:space="0" w:color="D9D9D9"/>
@@ -2222,8 +2222,8 @@
         <w:tblLook w:firstColumn="1" w:firstRow="1" w:lastColumn="0" w:lastRow="0" w:noHBand="0" w:noVBand="1" w:val="04A0"/>
       </w:tblPr>
       <w:tblGrid>
-        <w:gridCol w:w="4986"/>
-        <w:gridCol w:w="4986"/>
+        <w:gridCol w:w="4819"/>
+        <w:gridCol w:w="4819"/>
       </w:tblGrid>
       <w:tr>
         <w:trPr>
@@ -2231,7 +2231,7 @@
         </w:trPr>
         <w:tc>
           <w:tcPr>
-            <w:tcW w:type="dxa" w:w="4986"/>
+            <w:tcW w:type="dxa" w:w="4819"/>
             <w:vAlign w:val="center"/>
             <w:tcBorders>
               <w:top w:val="single" w:sz="6" w:space="0" w:color="D9D9D9"/>
@@ -2267,7 +2267,7 @@
         </w:tc>
         <w:tc>
           <w:tcPr>
-            <w:tcW w:type="dxa" w:w="4986"/>
+            <w:tcW w:type="dxa" w:w="4819"/>
             <w:vAlign w:val="center"/>
             <w:tcBorders>
               <w:top w:val="single" w:sz="6" w:space="0" w:color="D9D9D9"/>
@@ -2305,7 +2305,7 @@
       <w:tr>
         <w:tc>
           <w:tcPr>
-            <w:tcW w:type="dxa" w:w="4986"/>
+            <w:tcW w:type="dxa" w:w="4819"/>
             <w:vAlign w:val="center"/>
             <w:tcBorders>
               <w:top w:val="single" w:sz="6" w:space="0" w:color="D9D9D9"/>
@@ -2341,7 +2341,7 @@
         </w:tc>
         <w:tc>
           <w:tcPr>
-            <w:tcW w:type="dxa" w:w="4986"/>
+            <w:tcW w:type="dxa" w:w="4819"/>
             <w:vAlign w:val="center"/>
             <w:tcBorders>
               <w:top w:val="single" w:sz="6" w:space="0" w:color="D9D9D9"/>
@@ -2378,7 +2378,7 @@
       <w:tr>
         <w:tc>
           <w:tcPr>
-            <w:tcW w:type="dxa" w:w="4986"/>
+            <w:tcW w:type="dxa" w:w="4819"/>
             <w:vAlign w:val="center"/>
             <w:tcBorders>
               <w:top w:val="single" w:sz="6" w:space="0" w:color="D9D9D9"/>
@@ -2414,7 +2414,7 @@
         </w:tc>
         <w:tc>
           <w:tcPr>
-            <w:tcW w:type="dxa" w:w="4986"/>
+            <w:tcW w:type="dxa" w:w="4819"/>
             <w:vAlign w:val="center"/>
             <w:tcBorders>
               <w:top w:val="single" w:sz="6" w:space="0" w:color="D9D9D9"/>
@@ -2451,7 +2451,7 @@
       <w:tr>
         <w:tc>
           <w:tcPr>
-            <w:tcW w:type="dxa" w:w="4986"/>
+            <w:tcW w:type="dxa" w:w="4819"/>
             <w:vAlign w:val="center"/>
             <w:tcBorders>
               <w:top w:val="single" w:sz="6" w:space="0" w:color="D9D9D9"/>
@@ -2487,7 +2487,7 @@
         </w:tc>
         <w:tc>
           <w:tcPr>
-            <w:tcW w:type="dxa" w:w="4986"/>
+            <w:tcW w:type="dxa" w:w="4819"/>
             <w:vAlign w:val="center"/>
             <w:tcBorders>
               <w:top w:val="single" w:sz="6" w:space="0" w:color="D9D9D9"/>
@@ -2524,7 +2524,7 @@
       <w:tr>
         <w:tc>
           <w:tcPr>
-            <w:tcW w:type="dxa" w:w="4986"/>
+            <w:tcW w:type="dxa" w:w="4819"/>
             <w:vAlign w:val="center"/>
             <w:tcBorders>
               <w:top w:val="single" w:sz="6" w:space="0" w:color="D9D9D9"/>
@@ -2560,7 +2560,7 @@
         </w:tc>
         <w:tc>
           <w:tcPr>
-            <w:tcW w:type="dxa" w:w="4986"/>
+            <w:tcW w:type="dxa" w:w="4819"/>
             <w:vAlign w:val="center"/>
             <w:tcBorders>
               <w:top w:val="single" w:sz="6" w:space="0" w:color="D9D9D9"/>
@@ -2597,7 +2597,7 @@
       <w:tr>
         <w:tc>
           <w:tcPr>
-            <w:tcW w:type="dxa" w:w="4986"/>
+            <w:tcW w:type="dxa" w:w="4819"/>
             <w:vAlign w:val="center"/>
             <w:tcBorders>
               <w:top w:val="single" w:sz="6" w:space="0" w:color="D9D9D9"/>
@@ -2633,7 +2633,7 @@
         </w:tc>
         <w:tc>
           <w:tcPr>
-            <w:tcW w:type="dxa" w:w="4986"/>
+            <w:tcW w:type="dxa" w:w="4819"/>
             <w:vAlign w:val="center"/>
             <w:tcBorders>
               <w:top w:val="single" w:sz="6" w:space="0" w:color="D9D9D9"/>
@@ -2980,8 +2980,8 @@
         <w:tblLook w:firstColumn="1" w:firstRow="1" w:lastColumn="0" w:lastRow="0" w:noHBand="0" w:noVBand="1" w:val="04A0"/>
       </w:tblPr>
       <w:tblGrid>
-        <w:gridCol w:w="4986"/>
-        <w:gridCol w:w="4986"/>
+        <w:gridCol w:w="4819"/>
+        <w:gridCol w:w="4819"/>
       </w:tblGrid>
       <w:tr>
         <w:trPr>
@@ -2989,7 +2989,7 @@
         </w:trPr>
         <w:tc>
           <w:tcPr>
-            <w:tcW w:type="dxa" w:w="4986"/>
+            <w:tcW w:type="dxa" w:w="4819"/>
             <w:vAlign w:val="center"/>
             <w:tcBorders>
               <w:top w:val="single" w:sz="6" w:space="0" w:color="D9D9D9"/>
@@ -3025,7 +3025,7 @@
         </w:tc>
         <w:tc>
           <w:tcPr>
-            <w:tcW w:type="dxa" w:w="4986"/>
+            <w:tcW w:type="dxa" w:w="4819"/>
             <w:vAlign w:val="center"/>
             <w:tcBorders>
               <w:top w:val="single" w:sz="6" w:space="0" w:color="D9D9D9"/>
@@ -3063,7 +3063,7 @@
       <w:tr>
         <w:tc>
           <w:tcPr>
-            <w:tcW w:type="dxa" w:w="4986"/>
+            <w:tcW w:type="dxa" w:w="4819"/>
             <w:vAlign w:val="center"/>
             <w:tcBorders>
               <w:top w:val="single" w:sz="6" w:space="0" w:color="D9D9D9"/>
@@ -3099,7 +3099,7 @@
         </w:tc>
         <w:tc>
           <w:tcPr>
-            <w:tcW w:type="dxa" w:w="4986"/>
+            <w:tcW w:type="dxa" w:w="4819"/>
             <w:vAlign w:val="center"/>
             <w:tcBorders>
               <w:top w:val="single" w:sz="6" w:space="0" w:color="D9D9D9"/>
@@ -3136,7 +3136,7 @@
       <w:tr>
         <w:tc>
           <w:tcPr>
-            <w:tcW w:type="dxa" w:w="4986"/>
+            <w:tcW w:type="dxa" w:w="4819"/>
             <w:vAlign w:val="center"/>
             <w:tcBorders>
               <w:top w:val="single" w:sz="6" w:space="0" w:color="D9D9D9"/>
@@ -3172,7 +3172,7 @@
         </w:tc>
         <w:tc>
           <w:tcPr>
-            <w:tcW w:type="dxa" w:w="4986"/>
+            <w:tcW w:type="dxa" w:w="4819"/>
             <w:vAlign w:val="center"/>
             <w:tcBorders>
               <w:top w:val="single" w:sz="6" w:space="0" w:color="D9D9D9"/>
@@ -3209,7 +3209,7 @@
       <w:tr>
         <w:tc>
           <w:tcPr>
-            <w:tcW w:type="dxa" w:w="4986"/>
+            <w:tcW w:type="dxa" w:w="4819"/>
             <w:vAlign w:val="center"/>
             <w:tcBorders>
               <w:top w:val="single" w:sz="6" w:space="0" w:color="D9D9D9"/>
@@ -3245,7 +3245,7 @@
         </w:tc>
         <w:tc>
           <w:tcPr>
-            <w:tcW w:type="dxa" w:w="4986"/>
+            <w:tcW w:type="dxa" w:w="4819"/>
             <w:vAlign w:val="center"/>
             <w:tcBorders>
               <w:top w:val="single" w:sz="6" w:space="0" w:color="D9D9D9"/>
@@ -3282,7 +3282,7 @@
       <w:tr>
         <w:tc>
           <w:tcPr>
-            <w:tcW w:type="dxa" w:w="4986"/>
+            <w:tcW w:type="dxa" w:w="4819"/>
             <w:vAlign w:val="center"/>
             <w:tcBorders>
               <w:top w:val="single" w:sz="6" w:space="0" w:color="D9D9D9"/>
@@ -3318,7 +3318,7 @@
         </w:tc>
         <w:tc>
           <w:tcPr>
-            <w:tcW w:type="dxa" w:w="4986"/>
+            <w:tcW w:type="dxa" w:w="4819"/>
             <w:vAlign w:val="center"/>
             <w:tcBorders>
               <w:top w:val="single" w:sz="6" w:space="0" w:color="D9D9D9"/>
@@ -3355,7 +3355,7 @@
       <w:tr>
         <w:tc>
           <w:tcPr>
-            <w:tcW w:type="dxa" w:w="4986"/>
+            <w:tcW w:type="dxa" w:w="4819"/>
             <w:vAlign w:val="center"/>
             <w:tcBorders>
               <w:top w:val="single" w:sz="6" w:space="0" w:color="D9D9D9"/>
@@ -3391,7 +3391,7 @@
         </w:tc>
         <w:tc>
           <w:tcPr>
-            <w:tcW w:type="dxa" w:w="4986"/>
+            <w:tcW w:type="dxa" w:w="4819"/>
             <w:vAlign w:val="center"/>
             <w:tcBorders>
               <w:top w:val="single" w:sz="6" w:space="0" w:color="D9D9D9"/>
@@ -3770,8 +3770,8 @@
         <w:tblLook w:firstColumn="1" w:firstRow="1" w:lastColumn="0" w:lastRow="0" w:noHBand="0" w:noVBand="1" w:val="04A0"/>
       </w:tblPr>
       <w:tblGrid>
-        <w:gridCol w:w="4986"/>
-        <w:gridCol w:w="4986"/>
+        <w:gridCol w:w="4819"/>
+        <w:gridCol w:w="4819"/>
       </w:tblGrid>
       <w:tr>
         <w:trPr>
@@ -3779,7 +3779,7 @@
         </w:trPr>
         <w:tc>
           <w:tcPr>
-            <w:tcW w:type="dxa" w:w="4986"/>
+            <w:tcW w:type="dxa" w:w="4819"/>
             <w:vAlign w:val="center"/>
             <w:tcBorders>
               <w:top w:val="single" w:sz="6" w:space="0" w:color="D9D9D9"/>
@@ -3815,7 +3815,7 @@
         </w:tc>
         <w:tc>
           <w:tcPr>
-            <w:tcW w:type="dxa" w:w="4986"/>
+            <w:tcW w:type="dxa" w:w="4819"/>
             <w:vAlign w:val="center"/>
             <w:tcBorders>
               <w:top w:val="single" w:sz="6" w:space="0" w:color="D9D9D9"/>
@@ -3853,7 +3853,7 @@
       <w:tr>
         <w:tc>
           <w:tcPr>
-            <w:tcW w:type="dxa" w:w="4986"/>
+            <w:tcW w:type="dxa" w:w="4819"/>
             <w:vAlign w:val="center"/>
             <w:tcBorders>
               <w:top w:val="single" w:sz="6" w:space="0" w:color="D9D9D9"/>
@@ -3889,7 +3889,7 @@
         </w:tc>
         <w:tc>
           <w:tcPr>
-            <w:tcW w:type="dxa" w:w="4986"/>
+            <w:tcW w:type="dxa" w:w="4819"/>
             <w:vAlign w:val="center"/>
             <w:tcBorders>
               <w:top w:val="single" w:sz="6" w:space="0" w:color="D9D9D9"/>
@@ -3926,7 +3926,7 @@
       <w:tr>
         <w:tc>
           <w:tcPr>
-            <w:tcW w:type="dxa" w:w="4986"/>
+            <w:tcW w:type="dxa" w:w="4819"/>
             <w:vAlign w:val="center"/>
             <w:tcBorders>
               <w:top w:val="single" w:sz="6" w:space="0" w:color="D9D9D9"/>
@@ -3962,7 +3962,7 @@
         </w:tc>
         <w:tc>
           <w:tcPr>
-            <w:tcW w:type="dxa" w:w="4986"/>
+            <w:tcW w:type="dxa" w:w="4819"/>
             <w:vAlign w:val="center"/>
             <w:tcBorders>
               <w:top w:val="single" w:sz="6" w:space="0" w:color="D9D9D9"/>
@@ -3999,7 +3999,7 @@
       <w:tr>
         <w:tc>
           <w:tcPr>
-            <w:tcW w:type="dxa" w:w="4986"/>
+            <w:tcW w:type="dxa" w:w="4819"/>
             <w:vAlign w:val="center"/>
             <w:tcBorders>
               <w:top w:val="single" w:sz="6" w:space="0" w:color="D9D9D9"/>
@@ -4035,7 +4035,7 @@
         </w:tc>
         <w:tc>
           <w:tcPr>
-            <w:tcW w:type="dxa" w:w="4986"/>
+            <w:tcW w:type="dxa" w:w="4819"/>
             <w:vAlign w:val="center"/>
             <w:tcBorders>
               <w:top w:val="single" w:sz="6" w:space="0" w:color="D9D9D9"/>
@@ -4072,7 +4072,7 @@
       <w:tr>
         <w:tc>
           <w:tcPr>
-            <w:tcW w:type="dxa" w:w="4986"/>
+            <w:tcW w:type="dxa" w:w="4819"/>
             <w:vAlign w:val="center"/>
             <w:tcBorders>
               <w:top w:val="single" w:sz="6" w:space="0" w:color="D9D9D9"/>
@@ -4108,7 +4108,7 @@
         </w:tc>
         <w:tc>
           <w:tcPr>
-            <w:tcW w:type="dxa" w:w="4986"/>
+            <w:tcW w:type="dxa" w:w="4819"/>
             <w:vAlign w:val="center"/>
             <w:tcBorders>
               <w:top w:val="single" w:sz="6" w:space="0" w:color="D9D9D9"/>
@@ -4145,7 +4145,7 @@
       <w:tr>
         <w:tc>
           <w:tcPr>
-            <w:tcW w:type="dxa" w:w="4986"/>
+            <w:tcW w:type="dxa" w:w="4819"/>
             <w:vAlign w:val="center"/>
             <w:tcBorders>
               <w:top w:val="single" w:sz="6" w:space="0" w:color="D9D9D9"/>
@@ -4181,7 +4181,7 @@
         </w:tc>
         <w:tc>
           <w:tcPr>
-            <w:tcW w:type="dxa" w:w="4986"/>
+            <w:tcW w:type="dxa" w:w="4819"/>
             <w:vAlign w:val="center"/>
             <w:tcBorders>
               <w:top w:val="single" w:sz="6" w:space="0" w:color="D9D9D9"/>
@@ -4528,8 +4528,8 @@
         <w:tblLook w:firstColumn="1" w:firstRow="1" w:lastColumn="0" w:lastRow="0" w:noHBand="0" w:noVBand="1" w:val="04A0"/>
       </w:tblPr>
       <w:tblGrid>
-        <w:gridCol w:w="4986"/>
-        <w:gridCol w:w="4986"/>
+        <w:gridCol w:w="4819"/>
+        <w:gridCol w:w="4819"/>
       </w:tblGrid>
       <w:tr>
         <w:trPr>
@@ -4537,7 +4537,7 @@
         </w:trPr>
         <w:tc>
           <w:tcPr>
-            <w:tcW w:type="dxa" w:w="4986"/>
+            <w:tcW w:type="dxa" w:w="4819"/>
             <w:vAlign w:val="center"/>
             <w:tcBorders>
               <w:top w:val="single" w:sz="6" w:space="0" w:color="D9D9D9"/>
@@ -4573,7 +4573,7 @@
         </w:tc>
         <w:tc>
           <w:tcPr>
-            <w:tcW w:type="dxa" w:w="4986"/>
+            <w:tcW w:type="dxa" w:w="4819"/>
             <w:vAlign w:val="center"/>
             <w:tcBorders>
               <w:top w:val="single" w:sz="6" w:space="0" w:color="D9D9D9"/>
@@ -4611,7 +4611,7 @@
       <w:tr>
         <w:tc>
           <w:tcPr>
-            <w:tcW w:type="dxa" w:w="4986"/>
+            <w:tcW w:type="dxa" w:w="4819"/>
             <w:vAlign w:val="center"/>
             <w:tcBorders>
               <w:top w:val="single" w:sz="6" w:space="0" w:color="D9D9D9"/>
@@ -4647,7 +4647,7 @@
         </w:tc>
         <w:tc>
           <w:tcPr>
-            <w:tcW w:type="dxa" w:w="4986"/>
+            <w:tcW w:type="dxa" w:w="4819"/>
             <w:vAlign w:val="center"/>
             <w:tcBorders>
               <w:top w:val="single" w:sz="6" w:space="0" w:color="D9D9D9"/>
@@ -4684,7 +4684,7 @@
       <w:tr>
         <w:tc>
           <w:tcPr>
-            <w:tcW w:type="dxa" w:w="4986"/>
+            <w:tcW w:type="dxa" w:w="4819"/>
             <w:vAlign w:val="center"/>
             <w:tcBorders>
               <w:top w:val="single" w:sz="6" w:space="0" w:color="D9D9D9"/>
@@ -4720,7 +4720,7 @@
         </w:tc>
         <w:tc>
           <w:tcPr>
-            <w:tcW w:type="dxa" w:w="4986"/>
+            <w:tcW w:type="dxa" w:w="4819"/>
             <w:vAlign w:val="center"/>
             <w:tcBorders>
               <w:top w:val="single" w:sz="6" w:space="0" w:color="D9D9D9"/>
@@ -4757,7 +4757,7 @@
       <w:tr>
         <w:tc>
           <w:tcPr>
-            <w:tcW w:type="dxa" w:w="4986"/>
+            <w:tcW w:type="dxa" w:w="4819"/>
             <w:vAlign w:val="center"/>
             <w:tcBorders>
               <w:top w:val="single" w:sz="6" w:space="0" w:color="D9D9D9"/>
@@ -4793,7 +4793,7 @@
         </w:tc>
         <w:tc>
           <w:tcPr>
-            <w:tcW w:type="dxa" w:w="4986"/>
+            <w:tcW w:type="dxa" w:w="4819"/>
             <w:vAlign w:val="center"/>
             <w:tcBorders>
               <w:top w:val="single" w:sz="6" w:space="0" w:color="D9D9D9"/>
@@ -4830,7 +4830,7 @@
       <w:tr>
         <w:tc>
           <w:tcPr>
-            <w:tcW w:type="dxa" w:w="4986"/>
+            <w:tcW w:type="dxa" w:w="4819"/>
             <w:vAlign w:val="center"/>
             <w:tcBorders>
               <w:top w:val="single" w:sz="6" w:space="0" w:color="D9D9D9"/>
@@ -4866,7 +4866,7 @@
         </w:tc>
         <w:tc>
           <w:tcPr>
-            <w:tcW w:type="dxa" w:w="4986"/>
+            <w:tcW w:type="dxa" w:w="4819"/>
             <w:vAlign w:val="center"/>
             <w:tcBorders>
               <w:top w:val="single" w:sz="6" w:space="0" w:color="D9D9D9"/>
@@ -4903,7 +4903,7 @@
       <w:tr>
         <w:tc>
           <w:tcPr>
-            <w:tcW w:type="dxa" w:w="4986"/>
+            <w:tcW w:type="dxa" w:w="4819"/>
             <w:vAlign w:val="center"/>
             <w:tcBorders>
               <w:top w:val="single" w:sz="6" w:space="0" w:color="D9D9D9"/>
@@ -4939,7 +4939,7 @@
         </w:tc>
         <w:tc>
           <w:tcPr>
-            <w:tcW w:type="dxa" w:w="4986"/>
+            <w:tcW w:type="dxa" w:w="4819"/>
             <w:vAlign w:val="center"/>
             <w:tcBorders>
               <w:top w:val="single" w:sz="6" w:space="0" w:color="D9D9D9"/>
@@ -5286,8 +5286,8 @@
         <w:tblLook w:firstColumn="1" w:firstRow="1" w:lastColumn="0" w:lastRow="0" w:noHBand="0" w:noVBand="1" w:val="04A0"/>
       </w:tblPr>
       <w:tblGrid>
-        <w:gridCol w:w="4986"/>
-        <w:gridCol w:w="4986"/>
+        <w:gridCol w:w="4819"/>
+        <w:gridCol w:w="4819"/>
       </w:tblGrid>
       <w:tr>
         <w:trPr>
@@ -5295,7 +5295,7 @@
         </w:trPr>
         <w:tc>
           <w:tcPr>
-            <w:tcW w:type="dxa" w:w="4986"/>
+            <w:tcW w:type="dxa" w:w="4819"/>
             <w:vAlign w:val="center"/>
             <w:tcBorders>
               <w:top w:val="single" w:sz="6" w:space="0" w:color="D9D9D9"/>
@@ -5331,7 +5331,7 @@
         </w:tc>
         <w:tc>
           <w:tcPr>
-            <w:tcW w:type="dxa" w:w="4986"/>
+            <w:tcW w:type="dxa" w:w="4819"/>
             <w:vAlign w:val="center"/>
             <w:tcBorders>
               <w:top w:val="single" w:sz="6" w:space="0" w:color="D9D9D9"/>
@@ -5369,7 +5369,7 @@
       <w:tr>
         <w:tc>
           <w:tcPr>
-            <w:tcW w:type="dxa" w:w="4986"/>
+            <w:tcW w:type="dxa" w:w="4819"/>
             <w:vAlign w:val="center"/>
             <w:tcBorders>
               <w:top w:val="single" w:sz="6" w:space="0" w:color="D9D9D9"/>
@@ -5405,7 +5405,7 @@
         </w:tc>
         <w:tc>
           <w:tcPr>
-            <w:tcW w:type="dxa" w:w="4986"/>
+            <w:tcW w:type="dxa" w:w="4819"/>
             <w:vAlign w:val="center"/>
             <w:tcBorders>
               <w:top w:val="single" w:sz="6" w:space="0" w:color="D9D9D9"/>
@@ -5442,7 +5442,7 @@
       <w:tr>
         <w:tc>
           <w:tcPr>
-            <w:tcW w:type="dxa" w:w="4986"/>
+            <w:tcW w:type="dxa" w:w="4819"/>
             <w:vAlign w:val="center"/>
             <w:tcBorders>
               <w:top w:val="single" w:sz="6" w:space="0" w:color="D9D9D9"/>
@@ -5478,7 +5478,7 @@
         </w:tc>
         <w:tc>
           <w:tcPr>
-            <w:tcW w:type="dxa" w:w="4986"/>
+            <w:tcW w:type="dxa" w:w="4819"/>
             <w:vAlign w:val="center"/>
             <w:tcBorders>
               <w:top w:val="single" w:sz="6" w:space="0" w:color="D9D9D9"/>
@@ -5515,7 +5515,7 @@
       <w:tr>
         <w:tc>
           <w:tcPr>
-            <w:tcW w:type="dxa" w:w="4986"/>
+            <w:tcW w:type="dxa" w:w="4819"/>
             <w:vAlign w:val="center"/>
             <w:tcBorders>
               <w:top w:val="single" w:sz="6" w:space="0" w:color="D9D9D9"/>
@@ -5551,7 +5551,7 @@
         </w:tc>
         <w:tc>
           <w:tcPr>
-            <w:tcW w:type="dxa" w:w="4986"/>
+            <w:tcW w:type="dxa" w:w="4819"/>
             <w:vAlign w:val="center"/>
             <w:tcBorders>
               <w:top w:val="single" w:sz="6" w:space="0" w:color="D9D9D9"/>
@@ -5588,7 +5588,7 @@
       <w:tr>
         <w:tc>
           <w:tcPr>
-            <w:tcW w:type="dxa" w:w="4986"/>
+            <w:tcW w:type="dxa" w:w="4819"/>
             <w:vAlign w:val="center"/>
             <w:tcBorders>
               <w:top w:val="single" w:sz="6" w:space="0" w:color="D9D9D9"/>
@@ -5624,7 +5624,7 @@
         </w:tc>
         <w:tc>
           <w:tcPr>
-            <w:tcW w:type="dxa" w:w="4986"/>
+            <w:tcW w:type="dxa" w:w="4819"/>
             <w:vAlign w:val="center"/>
             <w:tcBorders>
               <w:top w:val="single" w:sz="6" w:space="0" w:color="D9D9D9"/>
@@ -5661,7 +5661,7 @@
       <w:tr>
         <w:tc>
           <w:tcPr>
-            <w:tcW w:type="dxa" w:w="4986"/>
+            <w:tcW w:type="dxa" w:w="4819"/>
             <w:vAlign w:val="center"/>
             <w:tcBorders>
               <w:top w:val="single" w:sz="6" w:space="0" w:color="D9D9D9"/>
@@ -5697,7 +5697,7 @@
         </w:tc>
         <w:tc>
           <w:tcPr>
-            <w:tcW w:type="dxa" w:w="4986"/>
+            <w:tcW w:type="dxa" w:w="4819"/>
             <w:vAlign w:val="center"/>
             <w:tcBorders>
               <w:top w:val="single" w:sz="6" w:space="0" w:color="D9D9D9"/>
@@ -6044,8 +6044,8 @@
         <w:tblLook w:firstColumn="1" w:firstRow="1" w:lastColumn="0" w:lastRow="0" w:noHBand="0" w:noVBand="1" w:val="04A0"/>
       </w:tblPr>
       <w:tblGrid>
-        <w:gridCol w:w="4986"/>
-        <w:gridCol w:w="4986"/>
+        <w:gridCol w:w="4819"/>
+        <w:gridCol w:w="4819"/>
       </w:tblGrid>
       <w:tr>
         <w:trPr>
@@ -6053,7 +6053,7 @@
         </w:trPr>
         <w:tc>
           <w:tcPr>
-            <w:tcW w:type="dxa" w:w="4986"/>
+            <w:tcW w:type="dxa" w:w="4819"/>
             <w:vAlign w:val="center"/>
             <w:tcBorders>
               <w:top w:val="single" w:sz="6" w:space="0" w:color="D9D9D9"/>
@@ -6089,7 +6089,7 @@
         </w:tc>
         <w:tc>
           <w:tcPr>
-            <w:tcW w:type="dxa" w:w="4986"/>
+            <w:tcW w:type="dxa" w:w="4819"/>
             <w:vAlign w:val="center"/>
             <w:tcBorders>
               <w:top w:val="single" w:sz="6" w:space="0" w:color="D9D9D9"/>
@@ -6127,7 +6127,7 @@
       <w:tr>
         <w:tc>
           <w:tcPr>
-            <w:tcW w:type="dxa" w:w="4986"/>
+            <w:tcW w:type="dxa" w:w="4819"/>
             <w:vAlign w:val="center"/>
             <w:tcBorders>
               <w:top w:val="single" w:sz="6" w:space="0" w:color="D9D9D9"/>
@@ -6163,7 +6163,7 @@
         </w:tc>
         <w:tc>
           <w:tcPr>
-            <w:tcW w:type="dxa" w:w="4986"/>
+            <w:tcW w:type="dxa" w:w="4819"/>
             <w:vAlign w:val="center"/>
             <w:tcBorders>
               <w:top w:val="single" w:sz="6" w:space="0" w:color="D9D9D9"/>
@@ -6200,7 +6200,7 @@
       <w:tr>
         <w:tc>
           <w:tcPr>
-            <w:tcW w:type="dxa" w:w="4986"/>
+            <w:tcW w:type="dxa" w:w="4819"/>
             <w:vAlign w:val="center"/>
             <w:tcBorders>
               <w:top w:val="single" w:sz="6" w:space="0" w:color="D9D9D9"/>
@@ -6236,7 +6236,7 @@
         </w:tc>
         <w:tc>
           <w:tcPr>
-            <w:tcW w:type="dxa" w:w="4986"/>
+            <w:tcW w:type="dxa" w:w="4819"/>
             <w:vAlign w:val="center"/>
             <w:tcBorders>
               <w:top w:val="single" w:sz="6" w:space="0" w:color="D9D9D9"/>
@@ -6273,7 +6273,7 @@
       <w:tr>
         <w:tc>
           <w:tcPr>
-            <w:tcW w:type="dxa" w:w="4986"/>
+            <w:tcW w:type="dxa" w:w="4819"/>
             <w:vAlign w:val="center"/>
             <w:tcBorders>
               <w:top w:val="single" w:sz="6" w:space="0" w:color="D9D9D9"/>
@@ -6309,7 +6309,7 @@
         </w:tc>
         <w:tc>
           <w:tcPr>
-            <w:tcW w:type="dxa" w:w="4986"/>
+            <w:tcW w:type="dxa" w:w="4819"/>
             <w:vAlign w:val="center"/>
             <w:tcBorders>
               <w:top w:val="single" w:sz="6" w:space="0" w:color="D9D9D9"/>
@@ -6346,7 +6346,7 @@
       <w:tr>
         <w:tc>
           <w:tcPr>
-            <w:tcW w:type="dxa" w:w="4986"/>
+            <w:tcW w:type="dxa" w:w="4819"/>
             <w:vAlign w:val="center"/>
             <w:tcBorders>
               <w:top w:val="single" w:sz="6" w:space="0" w:color="D9D9D9"/>
@@ -6382,7 +6382,7 @@
         </w:tc>
         <w:tc>
           <w:tcPr>
-            <w:tcW w:type="dxa" w:w="4986"/>
+            <w:tcW w:type="dxa" w:w="4819"/>
             <w:vAlign w:val="center"/>
             <w:tcBorders>
               <w:top w:val="single" w:sz="6" w:space="0" w:color="D9D9D9"/>
@@ -6419,7 +6419,7 @@
       <w:tr>
         <w:tc>
           <w:tcPr>
-            <w:tcW w:type="dxa" w:w="4986"/>
+            <w:tcW w:type="dxa" w:w="4819"/>
             <w:vAlign w:val="center"/>
             <w:tcBorders>
               <w:top w:val="single" w:sz="6" w:space="0" w:color="D9D9D9"/>
@@ -6455,7 +6455,7 @@
         </w:tc>
         <w:tc>
           <w:tcPr>
-            <w:tcW w:type="dxa" w:w="4986"/>
+            <w:tcW w:type="dxa" w:w="4819"/>
             <w:vAlign w:val="center"/>
             <w:tcBorders>
               <w:top w:val="single" w:sz="6" w:space="0" w:color="D9D9D9"/>
@@ -6786,8 +6786,8 @@
         <w:tblLook w:firstColumn="1" w:firstRow="1" w:lastColumn="0" w:lastRow="0" w:noHBand="0" w:noVBand="1" w:val="04A0"/>
       </w:tblPr>
       <w:tblGrid>
-        <w:gridCol w:w="4986"/>
-        <w:gridCol w:w="4986"/>
+        <w:gridCol w:w="4819"/>
+        <w:gridCol w:w="4819"/>
       </w:tblGrid>
       <w:tr>
         <w:trPr>
@@ -6795,7 +6795,7 @@
         </w:trPr>
         <w:tc>
           <w:tcPr>
-            <w:tcW w:type="dxa" w:w="4986"/>
+            <w:tcW w:type="dxa" w:w="4819"/>
             <w:vAlign w:val="center"/>
             <w:tcBorders>
               <w:top w:val="single" w:sz="6" w:space="0" w:color="D9D9D9"/>
@@ -6831,7 +6831,7 @@
         </w:tc>
         <w:tc>
           <w:tcPr>
-            <w:tcW w:type="dxa" w:w="4986"/>
+            <w:tcW w:type="dxa" w:w="4819"/>
             <w:vAlign w:val="center"/>
             <w:tcBorders>
               <w:top w:val="single" w:sz="6" w:space="0" w:color="D9D9D9"/>
@@ -6869,7 +6869,7 @@
       <w:tr>
         <w:tc>
           <w:tcPr>
-            <w:tcW w:type="dxa" w:w="4986"/>
+            <w:tcW w:type="dxa" w:w="4819"/>
             <w:vAlign w:val="center"/>
             <w:tcBorders>
               <w:top w:val="single" w:sz="6" w:space="0" w:color="D9D9D9"/>
@@ -6905,7 +6905,7 @@
         </w:tc>
         <w:tc>
           <w:tcPr>
-            <w:tcW w:type="dxa" w:w="4986"/>
+            <w:tcW w:type="dxa" w:w="4819"/>
             <w:vAlign w:val="center"/>
             <w:tcBorders>
               <w:top w:val="single" w:sz="6" w:space="0" w:color="D9D9D9"/>
@@ -6942,7 +6942,7 @@
       <w:tr>
         <w:tc>
           <w:tcPr>
-            <w:tcW w:type="dxa" w:w="4986"/>
+            <w:tcW w:type="dxa" w:w="4819"/>
             <w:vAlign w:val="center"/>
             <w:tcBorders>
               <w:top w:val="single" w:sz="6" w:space="0" w:color="D9D9D9"/>
@@ -6978,7 +6978,7 @@
         </w:tc>
         <w:tc>
           <w:tcPr>
-            <w:tcW w:type="dxa" w:w="4986"/>
+            <w:tcW w:type="dxa" w:w="4819"/>
             <w:vAlign w:val="center"/>
             <w:tcBorders>
               <w:top w:val="single" w:sz="6" w:space="0" w:color="D9D9D9"/>
@@ -7015,7 +7015,7 @@
       <w:tr>
         <w:tc>
           <w:tcPr>
-            <w:tcW w:type="dxa" w:w="4986"/>
+            <w:tcW w:type="dxa" w:w="4819"/>
             <w:vAlign w:val="center"/>
             <w:tcBorders>
               <w:top w:val="single" w:sz="6" w:space="0" w:color="D9D9D9"/>
@@ -7051,7 +7051,7 @@
         </w:tc>
         <w:tc>
           <w:tcPr>
-            <w:tcW w:type="dxa" w:w="4986"/>
+            <w:tcW w:type="dxa" w:w="4819"/>
             <w:vAlign w:val="center"/>
             <w:tcBorders>
               <w:top w:val="single" w:sz="6" w:space="0" w:color="D9D9D9"/>
@@ -7088,7 +7088,7 @@
       <w:tr>
         <w:tc>
           <w:tcPr>
-            <w:tcW w:type="dxa" w:w="4986"/>
+            <w:tcW w:type="dxa" w:w="4819"/>
             <w:vAlign w:val="center"/>
             <w:tcBorders>
               <w:top w:val="single" w:sz="6" w:space="0" w:color="D9D9D9"/>
@@ -7124,7 +7124,7 @@
         </w:tc>
         <w:tc>
           <w:tcPr>
-            <w:tcW w:type="dxa" w:w="4986"/>
+            <w:tcW w:type="dxa" w:w="4819"/>
             <w:vAlign w:val="center"/>
             <w:tcBorders>
               <w:top w:val="single" w:sz="6" w:space="0" w:color="D9D9D9"/>
@@ -7161,7 +7161,7 @@
       <w:tr>
         <w:tc>
           <w:tcPr>
-            <w:tcW w:type="dxa" w:w="4986"/>
+            <w:tcW w:type="dxa" w:w="4819"/>
             <w:vAlign w:val="center"/>
             <w:tcBorders>
               <w:top w:val="single" w:sz="6" w:space="0" w:color="D9D9D9"/>
@@ -7197,7 +7197,7 @@
         </w:tc>
         <w:tc>
           <w:tcPr>
-            <w:tcW w:type="dxa" w:w="4986"/>
+            <w:tcW w:type="dxa" w:w="4819"/>
             <w:vAlign w:val="center"/>
             <w:tcBorders>
               <w:top w:val="single" w:sz="6" w:space="0" w:color="D9D9D9"/>
@@ -7672,8 +7672,8 @@
         <w:tblLook w:firstColumn="1" w:firstRow="1" w:lastColumn="0" w:lastRow="0" w:noHBand="0" w:noVBand="1" w:val="04A0"/>
       </w:tblPr>
       <w:tblGrid>
-        <w:gridCol w:w="4986"/>
-        <w:gridCol w:w="4986"/>
+        <w:gridCol w:w="4819"/>
+        <w:gridCol w:w="4819"/>
       </w:tblGrid>
       <w:tr>
         <w:trPr>
@@ -7681,7 +7681,7 @@
         </w:trPr>
         <w:tc>
           <w:tcPr>
-            <w:tcW w:type="dxa" w:w="4986"/>
+            <w:tcW w:type="dxa" w:w="4819"/>
             <w:vAlign w:val="center"/>
             <w:tcBorders>
               <w:top w:val="single" w:sz="6" w:space="0" w:color="D9D9D9"/>
@@ -7717,7 +7717,7 @@
         </w:tc>
         <w:tc>
           <w:tcPr>
-            <w:tcW w:type="dxa" w:w="4986"/>
+            <w:tcW w:type="dxa" w:w="4819"/>
             <w:vAlign w:val="center"/>
             <w:tcBorders>
               <w:top w:val="single" w:sz="6" w:space="0" w:color="D9D9D9"/>
@@ -7755,7 +7755,7 @@
       <w:tr>
         <w:tc>
           <w:tcPr>
-            <w:tcW w:type="dxa" w:w="4986"/>
+            <w:tcW w:type="dxa" w:w="4819"/>
             <w:vAlign w:val="center"/>
             <w:tcBorders>
               <w:top w:val="single" w:sz="6" w:space="0" w:color="D9D9D9"/>
@@ -7791,7 +7791,7 @@
         </w:tc>
         <w:tc>
           <w:tcPr>
-            <w:tcW w:type="dxa" w:w="4986"/>
+            <w:tcW w:type="dxa" w:w="4819"/>
             <w:vAlign w:val="center"/>
             <w:tcBorders>
               <w:top w:val="single" w:sz="6" w:space="0" w:color="D9D9D9"/>
@@ -7828,7 +7828,7 @@
       <w:tr>
         <w:tc>
           <w:tcPr>
-            <w:tcW w:type="dxa" w:w="4986"/>
+            <w:tcW w:type="dxa" w:w="4819"/>
             <w:vAlign w:val="center"/>
             <w:tcBorders>
               <w:top w:val="single" w:sz="6" w:space="0" w:color="D9D9D9"/>
@@ -7864,7 +7864,7 @@
         </w:tc>
         <w:tc>
           <w:tcPr>
-            <w:tcW w:type="dxa" w:w="4986"/>
+            <w:tcW w:type="dxa" w:w="4819"/>
             <w:vAlign w:val="center"/>
             <w:tcBorders>
               <w:top w:val="single" w:sz="6" w:space="0" w:color="D9D9D9"/>
@@ -7901,7 +7901,7 @@
       <w:tr>
         <w:tc>
           <w:tcPr>
-            <w:tcW w:type="dxa" w:w="4986"/>
+            <w:tcW w:type="dxa" w:w="4819"/>
             <w:vAlign w:val="center"/>
             <w:tcBorders>
               <w:top w:val="single" w:sz="6" w:space="0" w:color="D9D9D9"/>
@@ -7937,7 +7937,7 @@
         </w:tc>
         <w:tc>
           <w:tcPr>
-            <w:tcW w:type="dxa" w:w="4986"/>
+            <w:tcW w:type="dxa" w:w="4819"/>
             <w:vAlign w:val="center"/>
             <w:tcBorders>
               <w:top w:val="single" w:sz="6" w:space="0" w:color="D9D9D9"/>
@@ -7974,7 +7974,7 @@
       <w:tr>
         <w:tc>
           <w:tcPr>
-            <w:tcW w:type="dxa" w:w="4986"/>
+            <w:tcW w:type="dxa" w:w="4819"/>
             <w:vAlign w:val="center"/>
             <w:tcBorders>
               <w:top w:val="single" w:sz="6" w:space="0" w:color="D9D9D9"/>
@@ -8010,7 +8010,7 @@
         </w:tc>
         <w:tc>
           <w:tcPr>
-            <w:tcW w:type="dxa" w:w="4986"/>
+            <w:tcW w:type="dxa" w:w="4819"/>
             <w:vAlign w:val="center"/>
             <w:tcBorders>
               <w:top w:val="single" w:sz="6" w:space="0" w:color="D9D9D9"/>
@@ -8047,7 +8047,7 @@
       <w:tr>
         <w:tc>
           <w:tcPr>
-            <w:tcW w:type="dxa" w:w="4986"/>
+            <w:tcW w:type="dxa" w:w="4819"/>
             <w:vAlign w:val="center"/>
             <w:tcBorders>
               <w:top w:val="single" w:sz="6" w:space="0" w:color="D9D9D9"/>
@@ -8083,7 +8083,7 @@
         </w:tc>
         <w:tc>
           <w:tcPr>
-            <w:tcW w:type="dxa" w:w="4986"/>
+            <w:tcW w:type="dxa" w:w="4819"/>
             <w:vAlign w:val="center"/>
             <w:tcBorders>
               <w:top w:val="single" w:sz="6" w:space="0" w:color="D9D9D9"/>
@@ -8217,7 +8217,7 @@
           <w:color w:val="000000"/>
           <w:sz w:val="21"/>
         </w:rPr>
-        <w:t>Customer chọn một order; API kiểm tra quyền sở hữu rồi trả order items, tổng tiền và lịch sử trạng thái nếu có.</w:t>
+        <w:t>Customer chọn một order; API kiểm tra quyền sở hữu rồi trả order items, tổng tiền và trạng thái order/payment hiện tại.</w:t>
       </w:r>
     </w:p>
     <w:p>
@@ -8518,7 +8518,7 @@
     </w:p>
     <w:sectPr>
       <w:footerReference w:type="default" r:id="rId9"/>
-      <w:pgSz w:w="12240" w:h="15840"/>
+      <w:pgSz w:w="11906" w:h="16838"/>
       <w:pgMar w:top="1020" w:right="1134" w:bottom="964" w:left="1134" w:header="720" w:footer="720" w:gutter="0"/>
       <w:cols w:space="720"/>
       <w:docGrid w:linePitch="360"/>

</xml_diff>